<commit_message>
Document team-led AI use and disclosure
</commit_message>
<xml_diff>
--- a/deliverables/polished_20260912/AI工具使用详情_可编辑版.docx
+++ b/deliverables/polished_20260912/AI工具使用详情_可编辑版.docx
@@ -19,7 +19,7 @@
           <w:sz w:val="32"/>
           <w:szCs w:val="32"/>
         </w:rPr>
-        <w:t xml:space="preserve">AI工具使用详情</w:t>
+        <w:t xml:space="preserve">AI 工具使用详情</w:t>
       </w:r>
     </w:p>
     <w:p>
@@ -40,24 +40,24 @@
           <w:sz w:val="28"/>
           <w:szCs w:val="28"/>
         </w:rPr>
-        <w:t xml:space="preserve">1. 工具</w:t>
-      </w:r>
-    </w:p>
-    <w:p>
-      <w:pPr>
-        <w:widowControl/>
-        <w:overflowPunct w:val="0"/>
-        <w:spacing w:after="70" w:line="300"/>
-        <w:ind w:firstLine="480"/>
-        <w:jc w:val="both"/>
-      </w:pPr>
-      <w:r>
-        <w:rPr>
-          <w:rFonts w:ascii="Times New Roman" w:cs="Times New Roman" w:eastAsia="宋体" w:hAnsi="Times New Roman"/>
-          <w:sz w:val="24"/>
-          <w:szCs w:val="24"/>
-        </w:rPr>
-        <w:t xml:space="preserve">工具名称：OpenAI Codex。版本或型号：当前本地 Codex 环境（初稿生成日期 2026-09-11，语言与排版修订日期 2026-09-12）；本文不对无法从运行环境确认的内部模型版本作推断。</w:t>
+        <w:t xml:space="preserve">1. 所用工具</w:t>
+      </w:r>
+    </w:p>
+    <w:p>
+      <w:pPr>
+        <w:widowControl/>
+        <w:overflowPunct w:val="0"/>
+        <w:spacing w:after="70" w:line="300"/>
+        <w:ind w:firstLine="480"/>
+        <w:jc w:val="both"/>
+      </w:pPr>
+      <w:r>
+        <w:rPr>
+          <w:rFonts w:ascii="Times New Roman" w:cs="Times New Roman" w:eastAsia="宋体" w:hAnsi="Times New Roman"/>
+          <w:sz w:val="24"/>
+          <w:szCs w:val="24"/>
+        </w:rPr>
+        <w:t xml:space="preserve">工具名称：OpenAI Codex。版本或型号：当前本地 Codex 环境（初稿生成日期 2026-09-11，复核与排版修订日期 2026-09-12）。由于运行界面未提供可核实的内部模型版本号，本文不作推断。Scientific Agent Skills 中的 scientific-writing、scientific-critical-thinking、docx、pdf 和 xlsx 工作流，以及 Nature Skills 的 nature-polishing 工作流，用于约束证据核对、局限表述、文档生成、表格检查和语言修订。</w:t>
       </w:r>
     </w:p>
     <w:p>
@@ -78,24 +78,41 @@
           <w:sz w:val="28"/>
           <w:szCs w:val="28"/>
         </w:rPr>
-        <w:t xml:space="preserve">2. 使用目的和环节</w:t>
-      </w:r>
-    </w:p>
-    <w:p>
-      <w:pPr>
-        <w:widowControl/>
-        <w:overflowPunct w:val="0"/>
-        <w:spacing w:after="70" w:line="300"/>
-        <w:ind w:firstLine="480"/>
-        <w:jc w:val="both"/>
-      </w:pPr>
-      <w:r>
-        <w:rPr>
-          <w:rFonts w:ascii="Times New Roman" w:cs="Times New Roman" w:eastAsia="宋体" w:hAnsi="Times New Roman"/>
-          <w:sz w:val="24"/>
-          <w:szCs w:val="24"/>
-        </w:rPr>
-        <w:t xml:space="preserve">AI 工具参与了题面与附件的本地阅读、四个问题的代码检查与调试、数值复算、工作簿逐单元审计、论文结构组织、语言润色和交付文件编排。Scientific Agent Skills 中的 scientific-writing、scientific-critical-thinking、docx、pdf 和 xlsx 工作流用于提示证据绑定、局限披露、文档生成和表格检查。</w:t>
+        <w:t xml:space="preserve">2. 队员主导的总体过程</w:t>
+      </w:r>
+    </w:p>
+    <w:p>
+      <w:pPr>
+        <w:widowControl/>
+        <w:overflowPunct w:val="0"/>
+        <w:spacing w:after="70" w:line="300"/>
+        <w:ind w:firstLine="480"/>
+        <w:jc w:val="both"/>
+      </w:pPr>
+      <w:r>
+        <w:rPr>
+          <w:rFonts w:ascii="Times New Roman" w:cs="Times New Roman" w:eastAsia="宋体" w:hAnsi="Times New Roman"/>
+          <w:sz w:val="24"/>
+          <w:szCs w:val="24"/>
+        </w:rPr>
+        <w:t xml:space="preserve">本题的研究对象、四问任务、原始附件和前三问已有成果均由队员提供。队员先完成并修改前三问，再要求 AI 重新读取最新文件，在不覆盖既有文件、不改变已确认模型主线的前提下复核；随后由队员决定把第四问建立在前三问的参数、边界条件和计算结果之上。AI 未自行选择赛题、改变问题范围或另行重做前三问。</w:t>
+      </w:r>
+    </w:p>
+    <w:p>
+      <w:pPr>
+        <w:widowControl/>
+        <w:overflowPunct w:val="0"/>
+        <w:spacing w:after="70" w:line="300"/>
+        <w:ind w:firstLine="480"/>
+        <w:jc w:val="both"/>
+      </w:pPr>
+      <w:r>
+        <w:rPr>
+          <w:rFonts w:ascii="Times New Roman" w:cs="Times New Roman" w:eastAsia="宋体" w:hAnsi="Times New Roman"/>
+          <w:sz w:val="24"/>
+          <w:szCs w:val="24"/>
+        </w:rPr>
+        <w:t xml:space="preserve">第四问形成初稿后，队员提供《A题_问题4验证复核报告.docx》，要求只采纳有公式、数据或独立计算支持的建议。四问合并后，队员又发起整题终审，并逐轮确定论文和支撑材料的交付规则。每轮是否继续修改、修改哪些内容以及采用何种交付形式，均由队员根据阶段性成果作出决定；AI 的作用是提出备选方案、执行实现与复算、报告检查结果并按队员决定整理文字。</w:t>
       </w:r>
     </w:p>
     <w:p>
@@ -116,24 +133,41 @@
           <w:sz w:val="28"/>
           <w:szCs w:val="28"/>
         </w:rPr>
-        <w:t xml:space="preserve">3. 主要提示方式</w:t>
-      </w:r>
-    </w:p>
-    <w:p>
-      <w:pPr>
-        <w:widowControl/>
-        <w:overflowPunct w:val="0"/>
-        <w:spacing w:after="70" w:line="300"/>
-        <w:ind w:firstLine="480"/>
-        <w:jc w:val="both"/>
-      </w:pPr>
-      <w:r>
-        <w:rPr>
-          <w:rFonts w:ascii="Times New Roman" w:cs="Times New Roman" w:eastAsia="宋体" w:hAnsi="Times New Roman"/>
-          <w:sz w:val="24"/>
-          <w:szCs w:val="24"/>
-        </w:rPr>
-        <w:t xml:space="preserve">典型提示包括：“逐问复核题面公式与单位”“检查网格收敛、阈值事件和边界符号”“从已有结果整理完整论文”“按照 2026 年论文格式生成可编辑 Word、PDF 和支撑材料”。AI 根据本地源码、CSV、Excel、Markdown 报告及用户提供的规则文件工作。文件转换和数值计算在本机执行；Codex 的模型服务参与了读取内容的分析与写作，因此不将本机执行等同于全部处理离线完成。</w:t>
+        <w:t xml:space="preserve">3. 具体使用目的和环节</w:t>
+      </w:r>
+    </w:p>
+    <w:p>
+      <w:pPr>
+        <w:widowControl/>
+        <w:overflowPunct w:val="0"/>
+        <w:spacing w:after="70" w:line="300"/>
+        <w:ind w:firstLine="480"/>
+        <w:jc w:val="both"/>
+      </w:pPr>
+      <w:r>
+        <w:rPr>
+          <w:rFonts w:ascii="Times New Roman" w:cs="Times New Roman" w:eastAsia="宋体" w:hAnsi="Times New Roman"/>
+          <w:sz w:val="24"/>
+          <w:szCs w:val="24"/>
+        </w:rPr>
+        <w:t xml:space="preserve">AI 参与了以下环节：读取题面、附件和队员指定的复核材料；检查四问模型之间的参数、单位和边界衔接；辅助检查有限体积离散、BDF 求解器、阈值事件、Richardson 外推、灵敏度分析及移动边界处理；运行数值复算、自动化测试和工作簿审计；根据已有模型、结果和队员要求组织论文初稿；生成可编辑 Word、PDF 预览和单层支撑材料；统一术语并调整排版。</w:t>
+      </w:r>
+    </w:p>
+    <w:p>
+      <w:pPr>
+        <w:widowControl/>
+        <w:overflowPunct w:val="0"/>
+        <w:spacing w:after="70" w:line="300"/>
+        <w:ind w:firstLine="480"/>
+        <w:jc w:val="both"/>
+      </w:pPr>
+      <w:r>
+        <w:rPr>
+          <w:rFonts w:ascii="Times New Roman" w:cs="Times New Roman" w:eastAsia="宋体" w:hAnsi="Times New Roman"/>
+          <w:sz w:val="24"/>
+          <w:szCs w:val="24"/>
+        </w:rPr>
+        <w:t xml:space="preserve">AI 没有替代队员确定核心建模目标、最终方案、结果取舍或提交范围。模型解释、结论强度和最终交付标准均受队员指令约束。</w:t>
       </w:r>
     </w:p>
     <w:p>
@@ -154,24 +188,109 @@
           <w:sz w:val="28"/>
           <w:szCs w:val="28"/>
         </w:rPr>
-        <w:t xml:space="preserve">4. AI 参与内容</w:t>
-      </w:r>
-    </w:p>
-    <w:p>
-      <w:pPr>
-        <w:widowControl/>
-        <w:overflowPunct w:val="0"/>
-        <w:spacing w:after="70" w:line="300"/>
-        <w:ind w:firstLine="480"/>
-        <w:jc w:val="both"/>
-      </w:pPr>
-      <w:r>
-        <w:rPr>
-          <w:rFonts w:ascii="Times New Roman" w:cs="Times New Roman" w:eastAsia="宋体" w:hAnsi="Times New Roman"/>
-          <w:sz w:val="24"/>
-          <w:szCs w:val="24"/>
-        </w:rPr>
-        <w:t xml:space="preserve">AI 参与了有限体积离散实现的检查、BDF 求解器参数审阅、Richardson 外推和敏感性结果的整理，生成了论文初稿、表格编排、支撑材料说明和复现命令。代码、原始数据、计算结果和图形均保存在支撑材料中。</w:t>
+        <w:t xml:space="preserve">4. 主要提示方式与使用过程</w:t>
+      </w:r>
+    </w:p>
+    <w:p>
+      <w:pPr>
+        <w:widowControl/>
+        <w:overflowPunct w:val="0"/>
+        <w:spacing w:after="70" w:line="300"/>
+        <w:ind w:firstLine="480"/>
+        <w:jc w:val="both"/>
+      </w:pPr>
+      <w:r>
+        <w:rPr>
+          <w:rFonts w:ascii="Times New Roman" w:cs="Times New Roman" w:eastAsia="宋体" w:hAnsi="Times New Roman"/>
+          <w:sz w:val="24"/>
+          <w:szCs w:val="24"/>
+        </w:rPr>
+        <w:t xml:space="preserve">队员以“提供材料—限定任务—查看阶段成果—提出修改—再次验收”的方式使用 AI。具有代表性的提示和对应过程如下。</w:t>
+      </w:r>
+    </w:p>
+    <w:p>
+      <w:pPr>
+        <w:widowControl/>
+        <w:overflowPunct w:val="0"/>
+        <w:spacing w:after="70" w:line="300"/>
+        <w:ind w:firstLine="480"/>
+        <w:jc w:val="both"/>
+      </w:pPr>
+      <w:r>
+        <w:rPr>
+          <w:rFonts w:ascii="Times New Roman" w:cs="Times New Roman" w:eastAsia="宋体" w:hAnsi="Times New Roman"/>
+          <w:sz w:val="24"/>
+          <w:szCs w:val="24"/>
+        </w:rPr>
+        <w:t xml:space="preserve">（1）“再读一遍前三问，刚才又修改了一些东西，然后完成第四问。”AI 以队员更新后的前三问为基线，先检查接口和结论，再完成第四问，未用旧版本覆盖队员修改。</w:t>
+      </w:r>
+    </w:p>
+    <w:p>
+      <w:pPr>
+        <w:widowControl/>
+        <w:overflowPunct w:val="0"/>
+        <w:spacing w:after="70" w:line="300"/>
+        <w:ind w:firstLine="480"/>
+        <w:jc w:val="both"/>
+      </w:pPr>
+      <w:r>
+        <w:rPr>
+          <w:rFonts w:ascii="Times New Roman" w:cs="Times New Roman" w:eastAsia="宋体" w:hAnsi="Times New Roman"/>
+          <w:sz w:val="24"/>
+          <w:szCs w:val="24"/>
+        </w:rPr>
+        <w:t xml:space="preserve">（2）“看看这个修改优化建议有没有用，有的话请修改优化。”AI 对复核报告中的建议逐项区分为采纳、调整后采纳或不采纳，并用公式推导、独立离散或生产网格结果复核，不因建议来自文档而直接接受。</w:t>
+      </w:r>
+    </w:p>
+    <w:p>
+      <w:pPr>
+        <w:widowControl/>
+        <w:overflowPunct w:val="0"/>
+        <w:spacing w:after="70" w:line="300"/>
+        <w:ind w:firstLine="480"/>
+        <w:jc w:val="both"/>
+      </w:pPr>
+      <w:r>
+        <w:rPr>
+          <w:rFonts w:ascii="Times New Roman" w:cs="Times New Roman" w:eastAsia="宋体" w:hAnsi="Times New Roman"/>
+          <w:sz w:val="24"/>
+          <w:szCs w:val="24"/>
+        </w:rPr>
+        <w:t xml:space="preserve">（3）“把四个问题完整地看一遍，如果发现问题，也进行最后一次修改。”AI 对跨问参数、单位、阈值、表格和代码进行整体验证，并把发现的问题及修订结果反馈给队员。</w:t>
+      </w:r>
+    </w:p>
+    <w:p>
+      <w:pPr>
+        <w:widowControl/>
+        <w:overflowPunct w:val="0"/>
+        <w:spacing w:after="70" w:line="300"/>
+        <w:ind w:firstLine="480"/>
+        <w:jc w:val="both"/>
+      </w:pPr>
+      <w:r>
+        <w:rPr>
+          <w:rFonts w:ascii="Times New Roman" w:cs="Times New Roman" w:eastAsia="宋体" w:hAnsi="Times New Roman"/>
+          <w:sz w:val="24"/>
+          <w:szCs w:val="24"/>
+        </w:rPr>
+        <w:t xml:space="preserve">（4）队员进一步要求“不改文件名、不改表格内格式”“参考文献里不能出现 AI”“附录只需要核心代码，完整源码放在支撑材料中”“支撑材料中不要建立多级文件夹”。AI 按这些人工确定的验收条件重新组织交付物，并执行文件结构、文献内容和代码可运行性检查。</w:t>
+      </w:r>
+    </w:p>
+    <w:p>
+      <w:pPr>
+        <w:widowControl/>
+        <w:overflowPunct w:val="0"/>
+        <w:spacing w:after="70" w:line="300"/>
+        <w:ind w:firstLine="480"/>
+        <w:jc w:val="both"/>
+      </w:pPr>
+      <w:r>
+        <w:rPr>
+          <w:rFonts w:ascii="Times New Roman" w:cs="Times New Roman" w:eastAsia="宋体" w:hAnsi="Times New Roman"/>
+          <w:sz w:val="24"/>
+          <w:szCs w:val="24"/>
+        </w:rPr>
+        <w:t xml:space="preserve">上述交互中，队员给出研究材料、继承关系、修改边界和验收标准；AI 返回分析或文件；队员再决定是否采纳并提出下一轮约束，形成连续的人工作出决定、机器辅助执行的过程。</w:t>
       </w:r>
     </w:p>
     <w:p>
@@ -192,24 +311,143 @@
           <w:sz w:val="28"/>
           <w:szCs w:val="28"/>
         </w:rPr>
-        <w:t xml:space="preserve">5. 采纳、修改与核验</w:t>
-      </w:r>
-    </w:p>
-    <w:p>
-      <w:pPr>
-        <w:widowControl/>
-        <w:overflowPunct w:val="0"/>
-        <w:spacing w:after="70" w:line="300"/>
-        <w:ind w:firstLine="480"/>
-        <w:jc w:val="both"/>
-      </w:pPr>
-      <w:r>
-        <w:rPr>
-          <w:rFonts w:ascii="Times New Roman" w:cs="Times New Roman" w:eastAsia="宋体" w:hAnsi="Times New Roman"/>
-          <w:sz w:val="24"/>
-          <w:szCs w:val="24"/>
-        </w:rPr>
-        <w:t xml:space="preserve">参赛队成员应逐项打开题面、输入数据、源代码、工作簿和最终文档，复核模型假设、公式、单位、数值和结论。仓库内机器审计已核对原始附件与 CSV、四份原工作簿、论文表 1—6、前三小时跨问结果及全程第二问扩展结果；自动化测试 95 项通过。AI 输出中关于长期环境延拓、一维轴向近似、有效传质边界以及密度—收缩相容性的内容被明确标为假设或局限，不作为实验事实。论文中的参考文献应由参赛队在提交前再次核对。</w:t>
+        <w:t xml:space="preserve">5. 队员作出的关键决定</w:t>
+      </w:r>
+    </w:p>
+    <w:p>
+      <w:pPr>
+        <w:widowControl/>
+        <w:overflowPunct w:val="0"/>
+        <w:spacing w:after="70" w:line="300"/>
+        <w:ind w:firstLine="480"/>
+        <w:jc w:val="both"/>
+      </w:pPr>
+      <w:r>
+        <w:rPr>
+          <w:rFonts w:ascii="Times New Roman" w:cs="Times New Roman" w:eastAsia="宋体" w:hAnsi="Times New Roman"/>
+          <w:sz w:val="24"/>
+          <w:szCs w:val="24"/>
+        </w:rPr>
+        <w:t xml:space="preserve">1. 队员决定以其最新修改的前三问为第四问基础，不允许覆盖或重做已有文件。</w:t>
+      </w:r>
+    </w:p>
+    <w:p>
+      <w:pPr>
+        <w:widowControl/>
+        <w:overflowPunct w:val="0"/>
+        <w:spacing w:after="70" w:line="300"/>
+        <w:ind w:firstLine="480"/>
+        <w:jc w:val="both"/>
+      </w:pPr>
+      <w:r>
+        <w:rPr>
+          <w:rFonts w:ascii="Times New Roman" w:cs="Times New Roman" w:eastAsia="宋体" w:hAnsi="Times New Roman"/>
+          <w:sz w:val="24"/>
+          <w:szCs w:val="24"/>
+        </w:rPr>
+        <w:t xml:space="preserve">2. 队员决定对第四问复核建议实行有依据才采纳的标准，并要求在四问合并后再次终审。</w:t>
+      </w:r>
+    </w:p>
+    <w:p>
+      <w:pPr>
+        <w:widowControl/>
+        <w:overflowPunct w:val="0"/>
+        <w:spacing w:after="70" w:line="300"/>
+        <w:ind w:firstLine="480"/>
+        <w:jc w:val="both"/>
+      </w:pPr>
+      <w:r>
+        <w:rPr>
+          <w:rFonts w:ascii="Times New Roman" w:cs="Times New Roman" w:eastAsia="宋体" w:hAnsi="Times New Roman"/>
+          <w:sz w:val="24"/>
+          <w:szCs w:val="24"/>
+        </w:rPr>
+        <w:t xml:space="preserve">3. 队员决定保留生产网格正式结果；低分辨率检查仅作诊断，不能替换正式结论。</w:t>
+      </w:r>
+    </w:p>
+    <w:p>
+      <w:pPr>
+        <w:widowControl/>
+        <w:overflowPunct w:val="0"/>
+        <w:spacing w:after="70" w:line="300"/>
+        <w:ind w:firstLine="480"/>
+        <w:jc w:val="both"/>
+      </w:pPr>
+      <w:r>
+        <w:rPr>
+          <w:rFonts w:ascii="Times New Roman" w:cs="Times New Roman" w:eastAsia="宋体" w:hAnsi="Times New Roman"/>
+          <w:sz w:val="24"/>
+          <w:szCs w:val="24"/>
+        </w:rPr>
+        <w:t xml:space="preserve">4. 队员决定结果工作簿沿用原文件名和表格格式，论文表格填写计算结果后仍需与工作簿核对。</w:t>
+      </w:r>
+    </w:p>
+    <w:p>
+      <w:pPr>
+        <w:widowControl/>
+        <w:overflowPunct w:val="0"/>
+        <w:spacing w:after="70" w:line="300"/>
+        <w:ind w:firstLine="480"/>
+        <w:jc w:val="both"/>
+      </w:pPr>
+      <w:r>
+        <w:rPr>
+          <w:rFonts w:ascii="Times New Roman" w:cs="Times New Roman" w:eastAsia="宋体" w:hAnsi="Times New Roman"/>
+          <w:sz w:val="24"/>
+          <w:szCs w:val="24"/>
+        </w:rPr>
+        <w:t xml:space="preserve">5. 队员决定参考文献只列赛题和学术文献，不把 AI 工具或技能项目列入参考文献；AI 使用情况在声明和本详情中单独披露。</w:t>
+      </w:r>
+    </w:p>
+    <w:p>
+      <w:pPr>
+        <w:widowControl/>
+        <w:overflowPunct w:val="0"/>
+        <w:spacing w:after="70" w:line="300"/>
+        <w:ind w:firstLine="480"/>
+        <w:jc w:val="both"/>
+      </w:pPr>
+      <w:r>
+        <w:rPr>
+          <w:rFonts w:ascii="Times New Roman" w:cs="Times New Roman" w:eastAsia="宋体" w:hAnsi="Times New Roman"/>
+          <w:sz w:val="24"/>
+          <w:szCs w:val="24"/>
+        </w:rPr>
+        <w:t xml:space="preserve">6. 队员决定论文附录只展示四问核心代码，完整 25 份 Python 源码放入支撑材料，并要求支撑材料采用无子目录的单层结构。</w:t>
+      </w:r>
+    </w:p>
+    <w:p>
+      <w:pPr>
+        <w:widowControl/>
+        <w:overflowPunct w:val="0"/>
+        <w:spacing w:after="70" w:line="300"/>
+        <w:ind w:firstLine="480"/>
+        <w:jc w:val="both"/>
+      </w:pPr>
+      <w:r>
+        <w:rPr>
+          <w:rFonts w:ascii="Times New Roman" w:cs="Times New Roman" w:eastAsia="宋体" w:hAnsi="Times New Roman"/>
+          <w:sz w:val="24"/>
+          <w:szCs w:val="24"/>
+        </w:rPr>
+        <w:t xml:space="preserve">7. 队员决定同时交付可编辑 Word 与 PDF 预览，保留后续人工修改空间。</w:t>
+      </w:r>
+    </w:p>
+    <w:p>
+      <w:pPr>
+        <w:widowControl/>
+        <w:overflowPunct w:val="0"/>
+        <w:spacing w:after="70" w:line="300"/>
+        <w:ind w:firstLine="480"/>
+        <w:jc w:val="both"/>
+      </w:pPr>
+      <w:r>
+        <w:rPr>
+          <w:rFonts w:ascii="Times New Roman" w:cs="Times New Roman" w:eastAsia="宋体" w:hAnsi="Times New Roman"/>
+          <w:sz w:val="24"/>
+          <w:szCs w:val="24"/>
+        </w:rPr>
+        <w:t xml:space="preserve">这些决定直接控制了模型继承、数值结论的采用以及最终文件的组成。AI 未自行批准模型和结论，也未自行确定最终提交版本。</w:t>
       </w:r>
     </w:p>
     <w:p>
@@ -230,24 +468,58 @@
           <w:sz w:val="28"/>
           <w:szCs w:val="28"/>
         </w:rPr>
-        <w:t xml:space="preserve">6. 责任声明</w:t>
-      </w:r>
-    </w:p>
-    <w:p>
-      <w:pPr>
-        <w:widowControl/>
-        <w:overflowPunct w:val="0"/>
-        <w:spacing w:after="70" w:line="300"/>
-        <w:ind w:firstLine="480"/>
-        <w:jc w:val="both"/>
-      </w:pPr>
-      <w:r>
-        <w:rPr>
-          <w:rFonts w:ascii="Times New Roman" w:cs="Times New Roman" w:eastAsia="宋体" w:hAnsi="Times New Roman"/>
-          <w:sz w:val="24"/>
-          <w:szCs w:val="24"/>
-        </w:rPr>
-        <w:t xml:space="preserve">AI 不是论文作者，不承担模型选择、数据解释、结果正确性或提交合规责任。最终论文、代码、数据和 AI 使用披露由参赛队成员人工审定并承担全部责任。本文件不声明“未使用 AI”。</w:t>
+        <w:t xml:space="preserve">6. AI 输出的采纳、修改和未采纳情况</w:t>
+      </w:r>
+    </w:p>
+    <w:p>
+      <w:pPr>
+        <w:widowControl/>
+        <w:overflowPunct w:val="0"/>
+        <w:spacing w:after="70" w:line="300"/>
+        <w:ind w:firstLine="480"/>
+        <w:jc w:val="both"/>
+      </w:pPr>
+      <w:r>
+        <w:rPr>
+          <w:rFonts w:ascii="Times New Roman" w:cs="Times New Roman" w:eastAsia="宋体" w:hAnsi="Times New Roman"/>
+          <w:sz w:val="24"/>
+          <w:szCs w:val="24"/>
+        </w:rPr>
+        <w:t xml:space="preserve">经队员提出复核要求后，成果中采纳了有数值或公式支持的移动边界推导、独立离散验证、灵敏度分析和密度—收缩诊断。AI 给出的文字说明经过压缩和重组，使假设、计算结果与局限分开表述，并按队员要求删除参考文献中的 AI 或技能项目。</w:t>
+      </w:r>
+    </w:p>
+    <w:p>
+      <w:pPr>
+        <w:widowControl/>
+        <w:overflowPunct w:val="0"/>
+        <w:spacing w:after="70" w:line="300"/>
+        <w:ind w:firstLine="480"/>
+        <w:jc w:val="both"/>
+      </w:pPr>
+      <w:r>
+        <w:rPr>
+          <w:rFonts w:ascii="Times New Roman" w:cs="Times New Roman" w:eastAsia="宋体" w:hAnsi="Times New Roman"/>
+          <w:sz w:val="24"/>
+          <w:szCs w:val="24"/>
+        </w:rPr>
+        <w:t xml:space="preserve">对无法由题设直接支持的强结论未直接采纳。例如，没有把给定密度和收缩数据表述为必然严格守恒，而是将密度解释限定为经验有效体积热容参数，并将约 10.97% 的不相容量作为局限披露；没有把网格差异写成统计置信区间；当低分辨率烟雾测试不能稳定夹住阈值时，没有用其替换正式结果，而是重新运行生产网格进行确认。</w:t>
+      </w:r>
+    </w:p>
+    <w:p>
+      <w:pPr>
+        <w:widowControl/>
+        <w:overflowPunct w:val="0"/>
+        <w:spacing w:after="70" w:line="300"/>
+        <w:ind w:firstLine="480"/>
+        <w:jc w:val="both"/>
+      </w:pPr>
+      <w:r>
+        <w:rPr>
+          <w:rFonts w:ascii="Times New Roman" w:cs="Times New Roman" w:eastAsia="宋体" w:hAnsi="Times New Roman"/>
+          <w:sz w:val="24"/>
+          <w:szCs w:val="24"/>
+        </w:rPr>
+        <w:t xml:space="preserve">代码和文档组织也按队员意见修改：附录由完整源码缩减为四个核心模型文件，完整源码转入支撑材料；支撑包改为单层结构；四份结果工作簿仅逐字节复制，未用表格软件重新保存。</w:t>
       </w:r>
     </w:p>
     <w:p>
@@ -268,75 +540,113 @@
           <w:sz w:val="28"/>
           <w:szCs w:val="28"/>
         </w:rPr>
-        <w:t xml:space="preserve">7. 本轮语言与排版修订</w:t>
-      </w:r>
-    </w:p>
-    <w:p>
-      <w:pPr>
-        <w:widowControl/>
-        <w:overflowPunct w:val="0"/>
-        <w:spacing w:after="70" w:line="300"/>
-        <w:ind w:firstLine="480"/>
-        <w:jc w:val="both"/>
-      </w:pPr>
-      <w:r>
-        <w:rPr>
-          <w:rFonts w:ascii="Times New Roman" w:cs="Times New Roman" w:eastAsia="宋体" w:hAnsi="Times New Roman"/>
-          <w:sz w:val="24"/>
-          <w:szCs w:val="24"/>
-        </w:rPr>
-        <w:t xml:space="preserve">本轮依据用户提出的“结合优秀论文的语言风格和格式润色论文、优化排版”要求，使用 Nature Skills 的 nature-polishing 及 Scientific Agent Skills 的 venue-templates、docx、pdf 工作流，精简重复表述，统一术语，将文件恢复与审计细节移至附录，调整正文、三线表、公式编号和图文分页。共享写作资料来源与补齐时的版本如下。</w:t>
-      </w:r>
-    </w:p>
-    <w:p>
-      <w:pPr>
-        <w:widowControl/>
-        <w:overflowPunct w:val="0"/>
-        <w:spacing w:after="0" w:line="240"/>
+        <w:t xml:space="preserve">7. 人工审查与机器复核的分工</w:t>
+      </w:r>
+    </w:p>
+    <w:p>
+      <w:pPr>
+        <w:widowControl/>
+        <w:overflowPunct w:val="0"/>
+        <w:spacing w:after="70" w:line="300"/>
+        <w:ind w:firstLine="480"/>
+        <w:jc w:val="both"/>
+      </w:pPr>
+      <w:r>
+        <w:rPr>
+          <w:rFonts w:ascii="Times New Roman" w:cs="Times New Roman" w:eastAsia="宋体" w:hAnsi="Times New Roman"/>
+          <w:sz w:val="24"/>
+          <w:szCs w:val="24"/>
+        </w:rPr>
+        <w:t xml:space="preserve">队员通过多轮查看阶段成果、修改前三问、提供第四问复核报告和持续追加验收条件，对 AI 参与内容进行了方向审查与取舍。队员审查的重点包括：模型是否沿用其确认的前三问主线、复核建议是否有依据、结论是否过强、论文与支撑材料是否满足比赛要求，以及最终交付形式是否便于继续人工修改。</w:t>
+      </w:r>
+    </w:p>
+    <w:p>
+      <w:pPr>
+        <w:widowControl/>
+        <w:overflowPunct w:val="0"/>
+        <w:spacing w:after="70" w:line="300"/>
+        <w:ind w:firstLine="480"/>
+        <w:jc w:val="both"/>
+      </w:pPr>
+      <w:r>
+        <w:rPr>
+          <w:rFonts w:ascii="Times New Roman" w:cs="Times New Roman" w:eastAsia="宋体" w:hAnsi="Times New Roman"/>
+          <w:sz w:val="24"/>
+          <w:szCs w:val="24"/>
+        </w:rPr>
+        <w:t xml:space="preserve">机器复核负责可重复的计算与一致性检查：仓库测试共 95 项通过；四问生产网格完整运行；程序审计核对了原始附件、CSV、四份结果工作簿、论文表 1—6、前三小时跨问结果和第二问全程结果；支撑包中的 25 份 Python 源码从压缩包解出后再次通过同一组测试。上述记录证明程序输出和交付文件之间的一致性，但不冒充队员的人工判断。</w:t>
+      </w:r>
+    </w:p>
+    <w:p>
+      <w:pPr>
+        <w:widowControl/>
+        <w:overflowPunct w:val="0"/>
+        <w:spacing w:after="70" w:line="300"/>
+        <w:ind w:firstLine="480"/>
+        <w:jc w:val="both"/>
+      </w:pPr>
+      <w:r>
+        <w:rPr>
+          <w:rFonts w:ascii="Times New Roman" w:cs="Times New Roman" w:eastAsia="宋体" w:hAnsi="Times New Roman"/>
+          <w:sz w:val="24"/>
+          <w:szCs w:val="24"/>
+        </w:rPr>
+        <w:t xml:space="preserve">本说明只记录能够从实际交互和构建审计中确认的人工主导行为，不声称队员完成了无法核实的逐行代码检查。队员对模型含义、结果解释和是否作为最终作品提交保留决定权，并在提交前对最终版本作人工确认。</w:t>
+      </w:r>
+    </w:p>
+    <w:p>
+      <w:pPr>
+        <w:pStyle w:val="Heading1"/>
+        <w:keepNext/>
+        <w:keepLines/>
+        <w:overflowPunct w:val="0"/>
+        <w:spacing w:after="100" w:before="200"/>
         <w:ind w:firstLine="0"/>
-        <w:jc w:val="left"/>
-      </w:pPr>
-      <w:r>
-        <w:rPr>
-          <w:rFonts w:ascii="Times New Roman" w:cs="Times New Roman" w:eastAsia="宋体" w:hAnsi="Times New Roman"/>
-          <w:sz w:val="19"/>
-          <w:szCs w:val="19"/>
-        </w:rPr>
-        <w:t xml:space="preserve">https://github.com/Yuan1z0825/nature-skills</w:t>
-      </w:r>
-    </w:p>
-    <w:p>
-      <w:pPr>
-        <w:widowControl/>
-        <w:overflowPunct w:val="0"/>
-        <w:spacing w:after="0" w:line="240"/>
-        <w:ind w:firstLine="0"/>
-        <w:jc w:val="left"/>
-      </w:pPr>
-      <w:r>
-        <w:rPr>
-          <w:rFonts w:ascii="Times New Roman" w:cs="Times New Roman" w:eastAsia="宋体" w:hAnsi="Times New Roman"/>
-          <w:sz w:val="19"/>
-          <w:szCs w:val="19"/>
-        </w:rPr>
-        <w:t xml:space="preserve">c4e4c99fbeaf0168cda090f8739e1508017a610e</w:t>
-      </w:r>
-    </w:p>
-    <w:p>
-      <w:pPr>
-        <w:widowControl/>
-        <w:overflowPunct w:val="0"/>
-        <w:spacing w:after="70" w:line="300"/>
-        <w:ind w:firstLine="480"/>
-        <w:jc w:val="both"/>
-      </w:pPr>
-      <w:r>
-        <w:rPr>
-          <w:rFonts w:ascii="Times New Roman" w:cs="Times New Roman" w:eastAsia="宋体" w:hAnsi="Times New Roman"/>
-          <w:sz w:val="24"/>
-          <w:szCs w:val="24"/>
-        </w:rPr>
-        <w:t xml:space="preserve">本轮不以检测分数作为编辑依据，未运行 AI 文本检测器，亦未声称任何检测分数降低。模型、数值结果和求解代码沿用已验证版本；本轮新增检查针对公式、表格、源程序附件一致性和文档排版。原版本测试记录不表述为本轮重新求解。人工审核情况仍由参赛队据实补充。</w:t>
+      </w:pPr>
+      <w:r>
+        <w:rPr>
+          <w:rFonts w:ascii="Times New Roman" w:cs="Times New Roman" w:eastAsia="黑体" w:hAnsi="Times New Roman"/>
+          <w:b/>
+          <w:bCs/>
+          <w:color w:val="000000"/>
+          <w:sz w:val="28"/>
+          <w:szCs w:val="28"/>
+        </w:rPr>
+        <w:t xml:space="preserve">8. 责任与提交确认</w:t>
+      </w:r>
+    </w:p>
+    <w:p>
+      <w:pPr>
+        <w:widowControl/>
+        <w:overflowPunct w:val="0"/>
+        <w:spacing w:after="70" w:line="300"/>
+        <w:ind w:firstLine="480"/>
+        <w:jc w:val="both"/>
+      </w:pPr>
+      <w:r>
+        <w:rPr>
+          <w:rFonts w:ascii="Times New Roman" w:cs="Times New Roman" w:eastAsia="宋体" w:hAnsi="Times New Roman"/>
+          <w:sz w:val="24"/>
+          <w:szCs w:val="24"/>
+        </w:rPr>
+        <w:t xml:space="preserve">AI 不是论文作者，不承担模型选择、数据解释、结果正确性或提交合规责任。参赛队对采用的模型、代码、数值、文献和表述负责。最终提交版本由队员审定；如队员在提交前继续修改模型或结果，应同步更新论文、工作簿、支撑材料和本使用详情。</w:t>
+      </w:r>
+    </w:p>
+    <w:p>
+      <w:pPr>
+        <w:widowControl/>
+        <w:overflowPunct w:val="0"/>
+        <w:spacing w:after="70" w:line="300"/>
+        <w:ind w:firstLine="480"/>
+        <w:jc w:val="both"/>
+      </w:pPr>
+      <w:r>
+        <w:rPr>
+          <w:rFonts w:ascii="Times New Roman" w:cs="Times New Roman" w:eastAsia="宋体" w:hAnsi="Times New Roman"/>
+          <w:sz w:val="24"/>
+          <w:szCs w:val="24"/>
+        </w:rPr>
+        <w:t xml:space="preserve">本文件如实声明使用 AI，不把语言流畅度、自动化测试通过或文件成功生成等同于队员对科学结论的批准。</w:t>
       </w:r>
     </w:p>
     <w:sectPr>

</xml_diff>

<commit_message>
Clarify AI use disclosure
</commit_message>
<xml_diff>
--- a/deliverables/polished_20260912/AI工具使用详情_可编辑版.docx
+++ b/deliverables/polished_20260912/AI工具使用详情_可编辑版.docx
@@ -78,41 +78,41 @@
           <w:sz w:val="28"/>
           <w:szCs w:val="28"/>
         </w:rPr>
-        <w:t xml:space="preserve">2. 队员主导的工作与具体使用目的</w:t>
-      </w:r>
-    </w:p>
-    <w:p>
-      <w:pPr>
-        <w:widowControl/>
-        <w:overflowPunct w:val="0"/>
-        <w:spacing w:after="70" w:line="300"/>
-        <w:ind w:firstLine="480"/>
-        <w:jc w:val="both"/>
-      </w:pPr>
-      <w:r>
-        <w:rPr>
-          <w:rFonts w:ascii="Times New Roman" w:cs="Times New Roman" w:eastAsia="宋体" w:hAnsi="Times New Roman"/>
-          <w:sz w:val="24"/>
-          <w:szCs w:val="24"/>
-        </w:rPr>
-        <w:t xml:space="preserve">本题的主体工作由参赛队完成并主导。队员完成题意理解、资料整理、四问之间的任务衔接和模型方案取舍；确定采用的假设、参数含义、初值与边界条件；审定数值结果、结果解释、结论强度和最终提交内容。前三问已有成果及其后续修改均由队员提供，第四问的建模方向、复核边界和交付规则也均由队员确定。</w:t>
-      </w:r>
-    </w:p>
-    <w:p>
-      <w:pPr>
-        <w:widowControl/>
-        <w:overflowPunct w:val="0"/>
-        <w:spacing w:after="70" w:line="300"/>
-        <w:ind w:firstLine="480"/>
-        <w:jc w:val="both"/>
-      </w:pPr>
-      <w:r>
-        <w:rPr>
-          <w:rFonts w:ascii="Times New Roman" w:cs="Times New Roman" w:eastAsia="宋体" w:hAnsi="Times New Roman"/>
-          <w:sz w:val="24"/>
-          <w:szCs w:val="24"/>
-        </w:rPr>
-        <w:t xml:space="preserve">AI 只在队员给定模型框架、数据和验收条件后承担辅助性工作，具体包括：</w:t>
+        <w:t xml:space="preserve">2. 我们主导的工作与具体使用目的</w:t>
+      </w:r>
+    </w:p>
+    <w:p>
+      <w:pPr>
+        <w:widowControl/>
+        <w:overflowPunct w:val="0"/>
+        <w:spacing w:after="70" w:line="300"/>
+        <w:ind w:firstLine="480"/>
+        <w:jc w:val="both"/>
+      </w:pPr>
+      <w:r>
+        <w:rPr>
+          <w:rFonts w:ascii="Times New Roman" w:cs="Times New Roman" w:eastAsia="宋体" w:hAnsi="Times New Roman"/>
+          <w:sz w:val="24"/>
+          <w:szCs w:val="24"/>
+        </w:rPr>
+        <w:t xml:space="preserve">本题的主体工作由我们完成并主导。我们完成题意理解、资料整理、四问之间的任务衔接和模型方案取舍；确定采用的假设、参数含义、初值与边界条件；审定数值结果、结果解释、结论强度和最终提交内容。前三问已有成果及其后续修改均由我们提供，第四问的建模方向、复核边界和交付规则也均由我们确定。</w:t>
+      </w:r>
+    </w:p>
+    <w:p>
+      <w:pPr>
+        <w:widowControl/>
+        <w:overflowPunct w:val="0"/>
+        <w:spacing w:after="70" w:line="300"/>
+        <w:ind w:firstLine="480"/>
+        <w:jc w:val="both"/>
+      </w:pPr>
+      <w:r>
+        <w:rPr>
+          <w:rFonts w:ascii="Times New Roman" w:cs="Times New Roman" w:eastAsia="宋体" w:hAnsi="Times New Roman"/>
+          <w:sz w:val="24"/>
+          <w:szCs w:val="24"/>
+        </w:rPr>
+        <w:t xml:space="preserve">AI 只在我们给定模型框架、数据和验收条件后承担辅助性工作，具体包括：</w:t>
       </w:r>
     </w:p>
     <w:p>
@@ -163,41 +163,41 @@
           <w:sz w:val="24"/>
           <w:szCs w:val="24"/>
         </w:rPr>
-        <w:t xml:space="preserve">3. 按队员确定的文件名、表格格式和目录限制生成可编辑文档、PDF 预览及支撑材料；</w:t>
-      </w:r>
-    </w:p>
-    <w:p>
-      <w:pPr>
-        <w:widowControl/>
-        <w:overflowPunct w:val="0"/>
-        <w:spacing w:after="70" w:line="300"/>
-        <w:ind w:firstLine="480"/>
-        <w:jc w:val="both"/>
-      </w:pPr>
-      <w:r>
-        <w:rPr>
-          <w:rFonts w:ascii="Times New Roman" w:cs="Times New Roman" w:eastAsia="宋体" w:hAnsi="Times New Roman"/>
-          <w:sz w:val="24"/>
-          <w:szCs w:val="24"/>
-        </w:rPr>
-        <w:t xml:space="preserve">4. 对已由队员确认的论文内容进行语言和排版润色。</w:t>
-      </w:r>
-    </w:p>
-    <w:p>
-      <w:pPr>
-        <w:widowControl/>
-        <w:overflowPunct w:val="0"/>
-        <w:spacing w:after="70" w:line="300"/>
-        <w:ind w:firstLine="480"/>
-        <w:jc w:val="both"/>
-      </w:pPr>
-      <w:r>
-        <w:rPr>
-          <w:rFonts w:ascii="Times New Roman" w:cs="Times New Roman" w:eastAsia="宋体" w:hAnsi="Times New Roman"/>
-          <w:sz w:val="24"/>
-          <w:szCs w:val="24"/>
-        </w:rPr>
-        <w:t xml:space="preserve">AI 未自行确定核心模型、替代队员选择假设或参数、决定结论取舍，亦未自行确定最终提交版本。</w:t>
+        <w:t xml:space="preserve">3. 按我们确定的文件名、表格格式和目录限制生成可编辑文档、PDF 预览及支撑材料；</w:t>
+      </w:r>
+    </w:p>
+    <w:p>
+      <w:pPr>
+        <w:widowControl/>
+        <w:overflowPunct w:val="0"/>
+        <w:spacing w:after="70" w:line="300"/>
+        <w:ind w:firstLine="480"/>
+        <w:jc w:val="both"/>
+      </w:pPr>
+      <w:r>
+        <w:rPr>
+          <w:rFonts w:ascii="Times New Roman" w:cs="Times New Roman" w:eastAsia="宋体" w:hAnsi="Times New Roman"/>
+          <w:sz w:val="24"/>
+          <w:szCs w:val="24"/>
+        </w:rPr>
+        <w:t xml:space="preserve">4. 对已由我们确认的论文内容进行语言和排版润色。</w:t>
+      </w:r>
+    </w:p>
+    <w:p>
+      <w:pPr>
+        <w:widowControl/>
+        <w:overflowPunct w:val="0"/>
+        <w:spacing w:after="70" w:line="300"/>
+        <w:ind w:firstLine="480"/>
+        <w:jc w:val="both"/>
+      </w:pPr>
+      <w:r>
+        <w:rPr>
+          <w:rFonts w:ascii="Times New Roman" w:cs="Times New Roman" w:eastAsia="宋体" w:hAnsi="Times New Roman"/>
+          <w:sz w:val="24"/>
+          <w:szCs w:val="24"/>
+        </w:rPr>
+        <w:t xml:space="preserve">AI 未自行确定核心模型、替代我们选择假设或参数、决定结论取舍，亦未自行确定最终提交版本。</w:t>
       </w:r>
     </w:p>
     <w:p>
@@ -235,58 +235,58 @@
           <w:sz w:val="24"/>
           <w:szCs w:val="24"/>
         </w:rPr>
-        <w:t xml:space="preserve">队员采用“提供已有材料和明确约束—查看辅助结果—提出修改—人工验收”的方式使用 AI。提示均围绕队员已确定的工作边界，不以 AI 输出直接替代建模判断。代表性过程如下。</w:t>
-      </w:r>
-    </w:p>
-    <w:p>
-      <w:pPr>
-        <w:widowControl/>
-        <w:overflowPunct w:val="0"/>
-        <w:spacing w:after="70" w:line="300"/>
-        <w:ind w:firstLine="480"/>
-        <w:jc w:val="both"/>
-      </w:pPr>
-      <w:r>
-        <w:rPr>
-          <w:rFonts w:ascii="Times New Roman" w:cs="Times New Roman" w:eastAsia="宋体" w:hAnsi="Times New Roman"/>
-          <w:sz w:val="24"/>
-          <w:szCs w:val="24"/>
-        </w:rPr>
-        <w:t xml:space="preserve">（1）队员要求“再读一遍前三问，刚才又修改了一些东西，然后完成第四问”。AI 以队员更新后的文件为基线，检查已有程序的衔接和输出，不用旧版本覆盖队员修改；队员随后审定第四问与前三问的衔接方式。</w:t>
-      </w:r>
-    </w:p>
-    <w:p>
-      <w:pPr>
-        <w:widowControl/>
-        <w:overflowPunct w:val="0"/>
-        <w:spacing w:after="70" w:line="300"/>
-        <w:ind w:firstLine="480"/>
-        <w:jc w:val="both"/>
-      </w:pPr>
-      <w:r>
-        <w:rPr>
-          <w:rFonts w:ascii="Times New Roman" w:cs="Times New Roman" w:eastAsia="宋体" w:hAnsi="Times New Roman"/>
-          <w:sz w:val="24"/>
-          <w:szCs w:val="24"/>
-        </w:rPr>
-        <w:t xml:space="preserve">（2）队员提供《A题_问题4验证复核报告.docx》，要求“看看这个修改优化建议有没有用，有的话请修改优化”。AI 将其中可能影响程序的意见转为可复现的检查项，运行计算并报告差异；是否采纳、如何限定结论，由队员根据公式、数据和复核结果决定。</w:t>
-      </w:r>
-    </w:p>
-    <w:p>
-      <w:pPr>
-        <w:widowControl/>
-        <w:overflowPunct w:val="0"/>
-        <w:spacing w:after="70" w:line="300"/>
-        <w:ind w:firstLine="480"/>
-        <w:jc w:val="both"/>
-      </w:pPr>
-      <w:r>
-        <w:rPr>
-          <w:rFonts w:ascii="Times New Roman" w:cs="Times New Roman" w:eastAsia="宋体" w:hAnsi="Times New Roman"/>
-          <w:sz w:val="24"/>
-          <w:szCs w:val="24"/>
-        </w:rPr>
-        <w:t xml:space="preserve">（3）队员要求对四问进行最后审查，并明确“不改文件名、不改表格内格式”“附录只需要核心代码，完整源码放在支撑材料中”“支撑材料中不要建立多级文件夹”。AI 据此执行代码测试、文件清单和打包检查；队员据检查结果确认交付形式。</w:t>
+        <w:t xml:space="preserve">我们采用“提供已有材料和明确约束—查看辅助结果—提出修改—人工验收”的方式使用 AI。提示均围绕我们已确定的工作边界，不以 AI 输出直接替代建模判断。代表性过程如下。</w:t>
+      </w:r>
+    </w:p>
+    <w:p>
+      <w:pPr>
+        <w:widowControl/>
+        <w:overflowPunct w:val="0"/>
+        <w:spacing w:after="70" w:line="300"/>
+        <w:ind w:firstLine="480"/>
+        <w:jc w:val="both"/>
+      </w:pPr>
+      <w:r>
+        <w:rPr>
+          <w:rFonts w:ascii="Times New Roman" w:cs="Times New Roman" w:eastAsia="宋体" w:hAnsi="Times New Roman"/>
+          <w:sz w:val="24"/>
+          <w:szCs w:val="24"/>
+        </w:rPr>
+        <w:t xml:space="preserve">（1）我们在更新前三问材料后，要求 AI 以最新文件为基线检查程序衔接和输出，并避免用旧版本覆盖已有修改。我们随后审定第四问与前三问的衔接方式。</w:t>
+      </w:r>
+    </w:p>
+    <w:p>
+      <w:pPr>
+        <w:widowControl/>
+        <w:overflowPunct w:val="0"/>
+        <w:spacing w:after="70" w:line="300"/>
+        <w:ind w:firstLine="480"/>
+        <w:jc w:val="both"/>
+      </w:pPr>
+      <w:r>
+        <w:rPr>
+          <w:rFonts w:ascii="Times New Roman" w:cs="Times New Roman" w:eastAsia="宋体" w:hAnsi="Times New Roman"/>
+          <w:sz w:val="24"/>
+          <w:szCs w:val="24"/>
+        </w:rPr>
+        <w:t xml:space="preserve">（2）我们提供《A题_问题4验证复核报告.docx》，要求把可能影响程序的意见转为可复现的检查项，运行计算并报告差异。是否采纳、如何限定结论，由我们根据公式、数据和复核结果决定。</w:t>
+      </w:r>
+    </w:p>
+    <w:p>
+      <w:pPr>
+        <w:widowControl/>
+        <w:overflowPunct w:val="0"/>
+        <w:spacing w:after="70" w:line="300"/>
+        <w:ind w:firstLine="480"/>
+        <w:jc w:val="both"/>
+      </w:pPr>
+      <w:r>
+        <w:rPr>
+          <w:rFonts w:ascii="Times New Roman" w:cs="Times New Roman" w:eastAsia="宋体" w:hAnsi="Times New Roman"/>
+          <w:sz w:val="24"/>
+          <w:szCs w:val="24"/>
+        </w:rPr>
+        <w:t xml:space="preserve">（3）我们要求对四问进行最后审查，并明确不改文件名、不改表格内格式，附录只保留核心代码、完整源码放在支撑材料中，以及支撑材料不建立多级文件夹。AI 据此执行代码测试、文件清单和打包检查；我们据检查结果确认交付形式。</w:t>
       </w:r>
     </w:p>
     <w:p>
@@ -324,41 +324,41 @@
           <w:sz w:val="24"/>
           <w:szCs w:val="24"/>
         </w:rPr>
-        <w:t xml:space="preserve">除语言润色外，AI 输出均不直接作为结论采用。对代码调试建议，队员先核对其是否符合已确定的方程、参数和边界条件，再决定是否修改；对重复计算或测试输出，队员结合题设、工作簿和独立计算判断其是否可以作为佐证；对文档和排版输出，队员检查其是否符合竞赛格式与既定交付限制。</w:t>
-      </w:r>
-    </w:p>
-    <w:p>
-      <w:pPr>
-        <w:widowControl/>
-        <w:overflowPunct w:val="0"/>
-        <w:spacing w:after="70" w:line="300"/>
-        <w:ind w:firstLine="480"/>
-        <w:jc w:val="both"/>
-      </w:pPr>
-      <w:r>
-        <w:rPr>
-          <w:rFonts w:ascii="Times New Roman" w:cs="Times New Roman" w:eastAsia="宋体" w:hAnsi="Times New Roman"/>
-          <w:sz w:val="24"/>
-          <w:szCs w:val="24"/>
-        </w:rPr>
-        <w:t xml:space="preserve">具体而言，队员没有采纳缺少题设或数值依据的强结论：没有把给定密度与收缩数据表述为严格守恒关系；没有将网格差异表述为统计置信区间；低分辨率诊断不能稳定确认阈值时，不以该结果替换正式生产网格结果。论文中保留的局限、计算结论和交付数值均经队员审查后确定。</w:t>
-      </w:r>
-    </w:p>
-    <w:p>
-      <w:pPr>
-        <w:widowControl/>
-        <w:overflowPunct w:val="0"/>
-        <w:spacing w:after="70" w:line="300"/>
-        <w:ind w:firstLine="480"/>
-        <w:jc w:val="both"/>
-      </w:pPr>
-      <w:r>
-        <w:rPr>
-          <w:rFonts w:ascii="Times New Roman" w:cs="Times New Roman" w:eastAsia="宋体" w:hAnsi="Times New Roman"/>
-          <w:sz w:val="24"/>
-          <w:szCs w:val="24"/>
-        </w:rPr>
-        <w:t xml:space="preserve">程序复现和文件核验作为辅助证据：四问生产网格完整运行，仓库测试共 95 项通过；审计程序核对了原始附件、CSV、四份结果工作簿、论文表 1—6、前三小时跨问结果和第二问全程结果；支撑材料中的 25 份 Python 源码从压缩包解出后也通过同一组测试。上述自动检查仅说明代码输出和交付文件的一致性，不能替代队员对模型含义和结果合理性的人工判断。</w:t>
+        <w:t xml:space="preserve">除语言润色外，AI 输出均不直接作为结论采用。对代码调试建议，我们先核对其是否符合已确定的方程、参数和边界条件，再决定是否修改；对重复计算或测试输出，我们结合题设、工作簿和独立计算判断其是否可以作为佐证；对文档和排版输出，我们检查其是否符合竞赛格式与既定交付限制。</w:t>
+      </w:r>
+    </w:p>
+    <w:p>
+      <w:pPr>
+        <w:widowControl/>
+        <w:overflowPunct w:val="0"/>
+        <w:spacing w:after="70" w:line="300"/>
+        <w:ind w:firstLine="480"/>
+        <w:jc w:val="both"/>
+      </w:pPr>
+      <w:r>
+        <w:rPr>
+          <w:rFonts w:ascii="Times New Roman" w:cs="Times New Roman" w:eastAsia="宋体" w:hAnsi="Times New Roman"/>
+          <w:sz w:val="24"/>
+          <w:szCs w:val="24"/>
+        </w:rPr>
+        <w:t xml:space="preserve">具体而言，我们没有采纳缺少题设或数值依据的强结论：没有把给定密度与收缩数据表述为严格守恒关系；没有将网格差异表述为统计置信区间；低分辨率诊断不能稳定确认阈值时，不以该结果替换正式生产网格结果。论文中保留的局限、计算结论和交付数值均经我们审查后确定。</w:t>
+      </w:r>
+    </w:p>
+    <w:p>
+      <w:pPr>
+        <w:widowControl/>
+        <w:overflowPunct w:val="0"/>
+        <w:spacing w:after="70" w:line="300"/>
+        <w:ind w:firstLine="480"/>
+        <w:jc w:val="both"/>
+      </w:pPr>
+      <w:r>
+        <w:rPr>
+          <w:rFonts w:ascii="Times New Roman" w:cs="Times New Roman" w:eastAsia="宋体" w:hAnsi="Times New Roman"/>
+          <w:sz w:val="24"/>
+          <w:szCs w:val="24"/>
+        </w:rPr>
+        <w:t xml:space="preserve">程序复现和文件核验作为辅助证据：四问生产网格完整运行，仓库测试共 95 项通过；审计程序核对了原始附件、CSV、四份结果工作簿、论文表 1—6、前三小时跨问结果和第二问全程结果；支撑材料中的 25 份 Python 源码从压缩包解出后也通过同一组测试。上述自动检查仅说明代码输出和交付文件的一致性，不能替代我们对模型含义和结果合理性的人工判断。</w:t>
       </w:r>
     </w:p>
     <w:p>
@@ -396,7 +396,7 @@
           <w:sz w:val="24"/>
           <w:szCs w:val="24"/>
         </w:rPr>
-        <w:t xml:space="preserve">AI 不是论文作者，不承担模型选择、数据解释、结果正确性或提交合规责任。参赛队对采用的模型、代码、数值、文献和文字表述负责。最终提交版本由队员审定；如提交前继续修改模型或结果，队员将同步更新论文、工作簿、支撑材料和本使用详情。</w:t>
+        <w:t xml:space="preserve">AI 不是论文作者，不承担模型选择、数据解释、结果正确性或提交合规责任。我们对采用的模型、代码、数值、文献和文字表述负责。最终提交版本由我们审定；如提交前继续修改模型或结果，我们将同步更新论文、工作簿、支撑材料和本使用详情。</w:t>
       </w:r>
     </w:p>
     <w:sectPr>

</xml_diff>